<commit_message>
feat: contact form, 4-language toggle (EN/HR/DE/AR), remove em-dashes, gitignore
</commit_message>
<xml_diff>
--- a/Godaddy podaci Blaž.docx
+++ b/Godaddy podaci Blaž.docx
@@ -8,11 +8,33 @@
           <w:lang w:val="en-US"/>
         </w:rPr>
       </w:pPr>
-      <w:r>
-        <w:rPr>
-          <w:lang w:val="en-US"/>
-        </w:rPr>
-        <w:t>Godaddy podaci Blaž</w:t>
+      <w:proofErr w:type="spellStart"/>
+      <w:r>
+        <w:rPr>
+          <w:lang w:val="en-US"/>
+        </w:rPr>
+        <w:t>Godaddy</w:t>
+      </w:r>
+      <w:proofErr w:type="spellEnd"/>
+      <w:r>
+        <w:rPr>
+          <w:lang w:val="en-US"/>
+        </w:rPr>
+        <w:t xml:space="preserve"> </w:t>
+      </w:r>
+      <w:proofErr w:type="spellStart"/>
+      <w:r>
+        <w:rPr>
+          <w:lang w:val="en-US"/>
+        </w:rPr>
+        <w:t>podaci</w:t>
+      </w:r>
+      <w:proofErr w:type="spellEnd"/>
+      <w:r>
+        <w:rPr>
+          <w:lang w:val="en-US"/>
+        </w:rPr>
+        <w:t xml:space="preserve"> Blaž</w:t>
       </w:r>
     </w:p>
     <w:p>
@@ -75,6 +97,139 @@
         </w:rPr>
         <w:t>kr-exp.com</w:t>
       </w:r>
+    </w:p>
+    <w:p>
+      <w:pPr>
+        <w:rPr>
+          <w:lang w:val="en-US"/>
+        </w:rPr>
+      </w:pPr>
+    </w:p>
+    <w:p>
+      <w:pPr>
+        <w:rPr>
+          <w:lang w:val="en-US"/>
+        </w:rPr>
+      </w:pPr>
+      <w:proofErr w:type="spellStart"/>
+      <w:r>
+        <w:rPr>
+          <w:lang w:val="en-US"/>
+        </w:rPr>
+        <w:t>Regica</w:t>
+      </w:r>
+      <w:proofErr w:type="spellEnd"/>
+      <w:r>
+        <w:rPr>
+          <w:lang w:val="en-US"/>
+        </w:rPr>
+        <w:t>:</w:t>
+      </w:r>
+    </w:p>
+    <w:p>
+      <w:pPr>
+        <w:rPr>
+          <w:lang w:val="en-US"/>
+        </w:rPr>
+      </w:pPr>
+      <w:r>
+        <w:rPr>
+          <w:lang w:val="en-US"/>
+        </w:rPr>
+        <w:t xml:space="preserve">Username: </w:t>
+      </w:r>
+      <w:hyperlink r:id="rId5" w:history="1">
+        <w:r>
+          <w:rPr>
+            <w:rStyle w:val="Hyperlink"/>
+            <w:lang w:val="en-US"/>
+          </w:rPr>
+          <w:t>bkutica7@gmail.com</w:t>
+        </w:r>
+      </w:hyperlink>
+    </w:p>
+    <w:p>
+      <w:pPr>
+        <w:rPr>
+          <w:lang w:val="en-US"/>
+        </w:rPr>
+      </w:pPr>
+      <w:r>
+        <w:rPr>
+          <w:lang w:val="en-US"/>
+        </w:rPr>
+        <w:t>Password: Mv7121990bk!</w:t>
+      </w:r>
+    </w:p>
+    <w:p>
+      <w:pPr>
+        <w:rPr>
+          <w:lang w:val="en-US"/>
+        </w:rPr>
+      </w:pPr>
+    </w:p>
+    <w:p>
+      <w:pPr>
+        <w:rPr>
+          <w:lang w:val="en-US"/>
+        </w:rPr>
+      </w:pPr>
+      <w:proofErr w:type="spellStart"/>
+      <w:r>
+        <w:rPr>
+          <w:lang w:val="en-US"/>
+        </w:rPr>
+        <w:t>Formspree</w:t>
+      </w:r>
+      <w:proofErr w:type="spellEnd"/>
+      <w:r>
+        <w:rPr>
+          <w:lang w:val="en-US"/>
+        </w:rPr>
+        <w:t>:</w:t>
+      </w:r>
+    </w:p>
+    <w:p>
+      <w:pPr>
+        <w:rPr>
+          <w:lang w:val="en-US"/>
+        </w:rPr>
+      </w:pPr>
+      <w:r>
+        <w:rPr>
+          <w:lang w:val="en-US"/>
+        </w:rPr>
+        <w:t xml:space="preserve">Username: </w:t>
+      </w:r>
+      <w:hyperlink r:id="rId6" w:history="1">
+        <w:r>
+          <w:rPr>
+            <w:rStyle w:val="Hyperlink"/>
+            <w:lang w:val="en-US"/>
+          </w:rPr>
+          <w:t>info@kr-exp.com</w:t>
+        </w:r>
+      </w:hyperlink>
+    </w:p>
+    <w:p>
+      <w:pPr>
+        <w:rPr>
+          <w:lang w:val="en-US"/>
+        </w:rPr>
+      </w:pPr>
+      <w:r>
+        <w:rPr>
+          <w:lang w:val="en-US"/>
+        </w:rPr>
+        <w:t>Password: Mv7121990bk!</w:t>
+      </w:r>
+    </w:p>
+    <w:p>
+      <w:pPr>
+        <w:rPr>
+          <w:lang w:val="en-US"/>
+        </w:rPr>
+      </w:pPr>
     </w:p>
     <w:sectPr>
       <w:pgSz w:w="11906" w:h="16838"/>

</xml_diff>